<commit_message>
Add Meta-only launch 1-pager and Open Day creative mock
Single-version core plan: campaigns, ad sets, angles, ads and creative
thumbnails on one page. Also fixes bold text in table cells of the
full strategy doc.

Co-Authored-By: Claude Opus 5.5 <noreply@anthropic.com>
Claude-Session: https://claude.ai/code/session_01WYxT2oKqHUxfsBrXZ2Myb2
</commit_message>
<xml_diff>
--- a/nxt-school-launch/NXT_School_Launch_Strategy.docx
+++ b/nxt-school-launch/NXT_School_Launch_Strategy.docx
@@ -410,6 +410,8 @@
             <w:r>
               <w:rPr>
                 <w:rFonts w:ascii="Arial" w:cs="Arial" w:eastAsia="Arial" w:hAnsi="Arial"/>
+                <w:b/>
+                <w:bCs/>
                 <w:sz w:val="18"/>
                 <w:szCs w:val="18"/>
               </w:rPr>
@@ -783,6 +785,8 @@
             <w:r>
               <w:rPr>
                 <w:rFonts w:ascii="Arial" w:cs="Arial" w:eastAsia="Arial" w:hAnsi="Arial"/>
+                <w:b/>
+                <w:bCs/>
                 <w:sz w:val="18"/>
                 <w:szCs w:val="18"/>
               </w:rPr>
@@ -830,6 +834,8 @@
             <w:r>
               <w:rPr>
                 <w:rFonts w:ascii="Arial" w:cs="Arial" w:eastAsia="Arial" w:hAnsi="Arial"/>
+                <w:b/>
+                <w:bCs/>
                 <w:sz w:val="18"/>
                 <w:szCs w:val="18"/>
               </w:rPr>
@@ -874,6 +880,8 @@
             <w:r>
               <w:rPr>
                 <w:rFonts w:ascii="Arial" w:cs="Arial" w:eastAsia="Arial" w:hAnsi="Arial"/>
+                <w:b/>
+                <w:bCs/>
                 <w:sz w:val="18"/>
                 <w:szCs w:val="18"/>
               </w:rPr>
@@ -949,6 +957,8 @@
             <w:r>
               <w:rPr>
                 <w:rFonts w:ascii="Arial" w:cs="Arial" w:eastAsia="Arial" w:hAnsi="Arial"/>
+                <w:b/>
+                <w:bCs/>
                 <w:sz w:val="18"/>
                 <w:szCs w:val="18"/>
               </w:rPr>
@@ -1016,6 +1026,8 @@
             <w:r>
               <w:rPr>
                 <w:rFonts w:ascii="Arial" w:cs="Arial" w:eastAsia="Arial" w:hAnsi="Arial"/>
+                <w:b/>
+                <w:bCs/>
                 <w:sz w:val="18"/>
                 <w:szCs w:val="18"/>
               </w:rPr>
@@ -1055,6 +1067,8 @@
             <w:r>
               <w:rPr>
                 <w:rFonts w:ascii="Arial" w:cs="Arial" w:eastAsia="Arial" w:hAnsi="Arial"/>
+                <w:b/>
+                <w:bCs/>
                 <w:sz w:val="18"/>
                 <w:szCs w:val="18"/>
               </w:rPr>
@@ -1071,6 +1085,8 @@
             <w:r>
               <w:rPr>
                 <w:rFonts w:ascii="Arial" w:cs="Arial" w:eastAsia="Arial" w:hAnsi="Arial"/>
+                <w:b/>
+                <w:bCs/>
                 <w:sz w:val="18"/>
                 <w:szCs w:val="18"/>
               </w:rPr>
@@ -1087,6 +1103,8 @@
             <w:r>
               <w:rPr>
                 <w:rFonts w:ascii="Arial" w:cs="Arial" w:eastAsia="Arial" w:hAnsi="Arial"/>
+                <w:b/>
+                <w:bCs/>
                 <w:sz w:val="18"/>
                 <w:szCs w:val="18"/>
               </w:rPr>
@@ -1131,6 +1149,8 @@
             <w:r>
               <w:rPr>
                 <w:rFonts w:ascii="Arial" w:cs="Arial" w:eastAsia="Arial" w:hAnsi="Arial"/>
+                <w:b/>
+                <w:bCs/>
                 <w:sz w:val="18"/>
                 <w:szCs w:val="18"/>
               </w:rPr>
@@ -1206,6 +1226,8 @@
             <w:r>
               <w:rPr>
                 <w:rFonts w:ascii="Arial" w:cs="Arial" w:eastAsia="Arial" w:hAnsi="Arial"/>
+                <w:b/>
+                <w:bCs/>
                 <w:sz w:val="18"/>
                 <w:szCs w:val="18"/>
               </w:rPr>
@@ -1253,6 +1275,8 @@
             <w:r>
               <w:rPr>
                 <w:rFonts w:ascii="Arial" w:cs="Arial" w:eastAsia="Arial" w:hAnsi="Arial"/>
+                <w:b/>
+                <w:bCs/>
                 <w:sz w:val="18"/>
                 <w:szCs w:val="18"/>
               </w:rPr>
@@ -1297,6 +1321,8 @@
             <w:r>
               <w:rPr>
                 <w:rFonts w:ascii="Arial" w:cs="Arial" w:eastAsia="Arial" w:hAnsi="Arial"/>
+                <w:b/>
+                <w:bCs/>
                 <w:sz w:val="18"/>
                 <w:szCs w:val="18"/>
               </w:rPr>
@@ -1372,6 +1398,8 @@
             <w:r>
               <w:rPr>
                 <w:rFonts w:ascii="Arial" w:cs="Arial" w:eastAsia="Arial" w:hAnsi="Arial"/>
+                <w:b/>
+                <w:bCs/>
                 <w:sz w:val="18"/>
                 <w:szCs w:val="18"/>
               </w:rPr>
@@ -1439,6 +1467,8 @@
             <w:r>
               <w:rPr>
                 <w:rFonts w:ascii="Arial" w:cs="Arial" w:eastAsia="Arial" w:hAnsi="Arial"/>
+                <w:b/>
+                <w:bCs/>
                 <w:sz w:val="18"/>
                 <w:szCs w:val="18"/>
               </w:rPr>
@@ -1514,6 +1544,8 @@
             <w:r>
               <w:rPr>
                 <w:rFonts w:ascii="Arial" w:cs="Arial" w:eastAsia="Arial" w:hAnsi="Arial"/>
+                <w:b/>
+                <w:bCs/>
                 <w:sz w:val="18"/>
                 <w:szCs w:val="18"/>
               </w:rPr>
@@ -1783,6 +1815,8 @@
             <w:r>
               <w:rPr>
                 <w:rFonts w:ascii="Arial" w:cs="Arial" w:eastAsia="Arial" w:hAnsi="Arial"/>
+                <w:b/>
+                <w:bCs/>
                 <w:sz w:val="18"/>
                 <w:szCs w:val="18"/>
               </w:rPr>
@@ -1814,6 +1848,8 @@
             <w:r>
               <w:rPr>
                 <w:rFonts w:ascii="Arial" w:cs="Arial" w:eastAsia="Arial" w:hAnsi="Arial"/>
+                <w:b/>
+                <w:bCs/>
                 <w:sz w:val="18"/>
                 <w:szCs w:val="18"/>
               </w:rPr>
@@ -1845,6 +1881,8 @@
             <w:r>
               <w:rPr>
                 <w:rFonts w:ascii="Arial" w:cs="Arial" w:eastAsia="Arial" w:hAnsi="Arial"/>
+                <w:b/>
+                <w:bCs/>
                 <w:sz w:val="18"/>
                 <w:szCs w:val="18"/>
               </w:rPr>
@@ -2569,6 +2607,8 @@
             <w:r>
               <w:rPr>
                 <w:rFonts w:ascii="Arial" w:cs="Arial" w:eastAsia="Arial" w:hAnsi="Arial"/>
+                <w:b/>
+                <w:bCs/>
                 <w:sz w:val="18"/>
                 <w:szCs w:val="18"/>
               </w:rPr>
@@ -2692,6 +2732,8 @@
             <w:r>
               <w:rPr>
                 <w:rFonts w:ascii="Arial" w:cs="Arial" w:eastAsia="Arial" w:hAnsi="Arial"/>
+                <w:b/>
+                <w:bCs/>
                 <w:sz w:val="19"/>
                 <w:szCs w:val="19"/>
               </w:rPr>
@@ -2948,6 +2990,8 @@
             <w:r>
               <w:rPr>
                 <w:rFonts w:ascii="Arial" w:cs="Arial" w:eastAsia="Arial" w:hAnsi="Arial"/>
+                <w:b/>
+                <w:bCs/>
                 <w:sz w:val="18"/>
                 <w:szCs w:val="18"/>
               </w:rPr>
@@ -3108,6 +3152,8 @@
             <w:r>
               <w:rPr>
                 <w:rFonts w:ascii="Arial" w:cs="Arial" w:eastAsia="Arial" w:hAnsi="Arial"/>
+                <w:b/>
+                <w:bCs/>
                 <w:sz w:val="18"/>
                 <w:szCs w:val="18"/>
               </w:rPr>
@@ -3268,6 +3314,8 @@
             <w:r>
               <w:rPr>
                 <w:rFonts w:ascii="Arial" w:cs="Arial" w:eastAsia="Arial" w:hAnsi="Arial"/>
+                <w:b/>
+                <w:bCs/>
                 <w:sz w:val="18"/>
                 <w:szCs w:val="18"/>
               </w:rPr>
@@ -3428,6 +3476,8 @@
             <w:r>
               <w:rPr>
                 <w:rFonts w:ascii="Arial" w:cs="Arial" w:eastAsia="Arial" w:hAnsi="Arial"/>
+                <w:b/>
+                <w:bCs/>
                 <w:sz w:val="18"/>
                 <w:szCs w:val="18"/>
               </w:rPr>
@@ -4461,6 +4511,8 @@
             <w:r>
               <w:rPr>
                 <w:rFonts w:ascii="Arial" w:cs="Arial" w:eastAsia="Arial" w:hAnsi="Arial"/>
+                <w:b/>
+                <w:bCs/>
                 <w:sz w:val="18"/>
                 <w:szCs w:val="18"/>
               </w:rPr>
@@ -4608,6 +4660,8 @@
             <w:r>
               <w:rPr>
                 <w:rFonts w:ascii="Arial" w:cs="Arial" w:eastAsia="Arial" w:hAnsi="Arial"/>
+                <w:b/>
+                <w:bCs/>
                 <w:sz w:val="18"/>
                 <w:szCs w:val="18"/>
               </w:rPr>
@@ -5561,6 +5615,8 @@
             <w:r>
               <w:rPr>
                 <w:rFonts w:ascii="Arial" w:cs="Arial" w:eastAsia="Arial" w:hAnsi="Arial"/>
+                <w:b/>
+                <w:bCs/>
                 <w:sz w:val="18"/>
                 <w:szCs w:val="18"/>
               </w:rPr>
@@ -5615,6 +5671,8 @@
             <w:r>
               <w:rPr>
                 <w:rFonts w:ascii="Arial" w:cs="Arial" w:eastAsia="Arial" w:hAnsi="Arial"/>
+                <w:b/>
+                <w:bCs/>
                 <w:sz w:val="18"/>
                 <w:szCs w:val="18"/>
               </w:rPr>
@@ -5646,6 +5704,8 @@
             <w:r>
               <w:rPr>
                 <w:rFonts w:ascii="Arial" w:cs="Arial" w:eastAsia="Arial" w:hAnsi="Arial"/>
+                <w:b/>
+                <w:bCs/>
                 <w:sz w:val="18"/>
                 <w:szCs w:val="18"/>
               </w:rPr>
@@ -5677,6 +5737,8 @@
             <w:r>
               <w:rPr>
                 <w:rFonts w:ascii="Arial" w:cs="Arial" w:eastAsia="Arial" w:hAnsi="Arial"/>
+                <w:b/>
+                <w:bCs/>
                 <w:sz w:val="18"/>
                 <w:szCs w:val="18"/>
               </w:rPr>
@@ -5948,6 +6010,8 @@
             <w:r>
               <w:rPr>
                 <w:rFonts w:ascii="Arial" w:cs="Arial" w:eastAsia="Arial" w:hAnsi="Arial"/>
+                <w:b/>
+                <w:bCs/>
                 <w:sz w:val="18"/>
                 <w:szCs w:val="18"/>
               </w:rPr>
@@ -6139,6 +6203,8 @@
             <w:r>
               <w:rPr>
                 <w:rFonts w:ascii="Arial" w:cs="Arial" w:eastAsia="Arial" w:hAnsi="Arial"/>
+                <w:b/>
+                <w:bCs/>
                 <w:sz w:val="18"/>
                 <w:szCs w:val="18"/>
               </w:rPr>
@@ -6330,6 +6396,8 @@
             <w:r>
               <w:rPr>
                 <w:rFonts w:ascii="Arial" w:cs="Arial" w:eastAsia="Arial" w:hAnsi="Arial"/>
+                <w:b/>
+                <w:bCs/>
                 <w:sz w:val="18"/>
                 <w:szCs w:val="18"/>
               </w:rPr>
@@ -7898,6 +7966,8 @@
             <w:r>
               <w:rPr>
                 <w:rFonts w:ascii="Arial" w:cs="Arial" w:eastAsia="Arial" w:hAnsi="Arial"/>
+                <w:b/>
+                <w:bCs/>
                 <w:sz w:val="18"/>
                 <w:szCs w:val="18"/>
               </w:rPr>
@@ -8004,6 +8074,8 @@
             <w:r>
               <w:rPr>
                 <w:rFonts w:ascii="Arial" w:cs="Arial" w:eastAsia="Arial" w:hAnsi="Arial"/>
+                <w:b/>
+                <w:bCs/>
                 <w:sz w:val="18"/>
                 <w:szCs w:val="18"/>
               </w:rPr>
@@ -8110,6 +8182,8 @@
             <w:r>
               <w:rPr>
                 <w:rFonts w:ascii="Arial" w:cs="Arial" w:eastAsia="Arial" w:hAnsi="Arial"/>
+                <w:b/>
+                <w:bCs/>
                 <w:sz w:val="18"/>
                 <w:szCs w:val="18"/>
               </w:rPr>
@@ -8216,6 +8290,8 @@
             <w:r>
               <w:rPr>
                 <w:rFonts w:ascii="Arial" w:cs="Arial" w:eastAsia="Arial" w:hAnsi="Arial"/>
+                <w:b/>
+                <w:bCs/>
                 <w:sz w:val="18"/>
                 <w:szCs w:val="18"/>
               </w:rPr>
@@ -8459,6 +8535,8 @@
             <w:r>
               <w:rPr>
                 <w:rFonts w:ascii="Arial" w:cs="Arial" w:eastAsia="Arial" w:hAnsi="Arial"/>
+                <w:b/>
+                <w:bCs/>
                 <w:sz w:val="18"/>
                 <w:szCs w:val="18"/>
               </w:rPr>
@@ -8557,6 +8635,8 @@
             <w:r>
               <w:rPr>
                 <w:rFonts w:ascii="Arial" w:cs="Arial" w:eastAsia="Arial" w:hAnsi="Arial"/>
+                <w:b/>
+                <w:bCs/>
                 <w:sz w:val="18"/>
                 <w:szCs w:val="18"/>
               </w:rPr>
@@ -8655,6 +8735,8 @@
             <w:r>
               <w:rPr>
                 <w:rFonts w:ascii="Arial" w:cs="Arial" w:eastAsia="Arial" w:hAnsi="Arial"/>
+                <w:b/>
+                <w:bCs/>
                 <w:sz w:val="18"/>
                 <w:szCs w:val="18"/>
               </w:rPr>
@@ -8753,6 +8835,8 @@
             <w:r>
               <w:rPr>
                 <w:rFonts w:ascii="Arial" w:cs="Arial" w:eastAsia="Arial" w:hAnsi="Arial"/>
+                <w:b/>
+                <w:bCs/>
                 <w:sz w:val="18"/>
                 <w:szCs w:val="18"/>
               </w:rPr>
@@ -8851,6 +8935,8 @@
             <w:r>
               <w:rPr>
                 <w:rFonts w:ascii="Arial" w:cs="Arial" w:eastAsia="Arial" w:hAnsi="Arial"/>
+                <w:b/>
+                <w:bCs/>
                 <w:sz w:val="18"/>
                 <w:szCs w:val="18"/>
               </w:rPr>
@@ -9442,6 +9528,8 @@
             <w:r>
               <w:rPr>
                 <w:rFonts w:ascii="Arial" w:cs="Arial" w:eastAsia="Arial" w:hAnsi="Arial"/>
+                <w:b/>
+                <w:bCs/>
                 <w:sz w:val="18"/>
                 <w:szCs w:val="18"/>
               </w:rPr>
@@ -9638,6 +9726,8 @@
             <w:r>
               <w:rPr>
                 <w:rFonts w:ascii="Arial" w:cs="Arial" w:eastAsia="Arial" w:hAnsi="Arial"/>
+                <w:b/>
+                <w:bCs/>
                 <w:sz w:val="18"/>
                 <w:szCs w:val="18"/>
               </w:rPr>
@@ -9996,6 +10086,8 @@
             <w:r>
               <w:rPr>
                 <w:rFonts w:ascii="Arial" w:cs="Arial" w:eastAsia="Arial" w:hAnsi="Arial"/>
+                <w:b/>
+                <w:bCs/>
                 <w:sz w:val="18"/>
                 <w:szCs w:val="18"/>
               </w:rPr>
@@ -10141,6 +10233,8 @@
             <w:r>
               <w:rPr>
                 <w:rFonts w:ascii="Arial" w:cs="Arial" w:eastAsia="Arial" w:hAnsi="Arial"/>
+                <w:b/>
+                <w:bCs/>
                 <w:sz w:val="18"/>
                 <w:szCs w:val="18"/>
               </w:rPr>
@@ -10286,6 +10380,8 @@
             <w:r>
               <w:rPr>
                 <w:rFonts w:ascii="Arial" w:cs="Arial" w:eastAsia="Arial" w:hAnsi="Arial"/>
+                <w:b/>
+                <w:bCs/>
                 <w:sz w:val="18"/>
                 <w:szCs w:val="18"/>
               </w:rPr>
@@ -10810,6 +10906,8 @@
             <w:r>
               <w:rPr>
                 <w:rFonts w:ascii="Arial" w:cs="Arial" w:eastAsia="Arial" w:hAnsi="Arial"/>
+                <w:b/>
+                <w:bCs/>
                 <w:sz w:val="18"/>
                 <w:szCs w:val="18"/>
               </w:rPr>
@@ -10887,6 +10985,8 @@
             <w:r>
               <w:rPr>
                 <w:rFonts w:ascii="Arial" w:cs="Arial" w:eastAsia="Arial" w:hAnsi="Arial"/>
+                <w:b/>
+                <w:bCs/>
                 <w:sz w:val="18"/>
                 <w:szCs w:val="18"/>
               </w:rPr>
@@ -11974,6 +12074,8 @@
             <w:r>
               <w:rPr>
                 <w:rFonts w:ascii="Arial" w:cs="Arial" w:eastAsia="Arial" w:hAnsi="Arial"/>
+                <w:b/>
+                <w:bCs/>
                 <w:sz w:val="18"/>
                 <w:szCs w:val="18"/>
               </w:rPr>
@@ -12028,6 +12130,8 @@
             <w:r>
               <w:rPr>
                 <w:rFonts w:ascii="Arial" w:cs="Arial" w:eastAsia="Arial" w:hAnsi="Arial"/>
+                <w:b/>
+                <w:bCs/>
                 <w:sz w:val="18"/>
                 <w:szCs w:val="18"/>
               </w:rPr>
@@ -12059,6 +12163,8 @@
             <w:r>
               <w:rPr>
                 <w:rFonts w:ascii="Arial" w:cs="Arial" w:eastAsia="Arial" w:hAnsi="Arial"/>
+                <w:b/>
+                <w:bCs/>
                 <w:sz w:val="18"/>
                 <w:szCs w:val="18"/>
               </w:rPr>
@@ -13477,6 +13583,8 @@
             <w:r>
               <w:rPr>
                 <w:rFonts w:ascii="Arial" w:cs="Arial" w:eastAsia="Arial" w:hAnsi="Arial"/>
+                <w:b/>
+                <w:bCs/>
                 <w:sz w:val="18"/>
                 <w:szCs w:val="18"/>
               </w:rPr>
@@ -13700,6 +13808,8 @@
             <w:r>
               <w:rPr>
                 <w:rFonts w:ascii="Arial" w:cs="Arial" w:eastAsia="Arial" w:hAnsi="Arial"/>
+                <w:b/>
+                <w:bCs/>
                 <w:sz w:val="18"/>
                 <w:szCs w:val="18"/>
               </w:rPr>
@@ -15077,6 +15187,8 @@
             <w:r>
               <w:rPr>
                 <w:rFonts w:ascii="Arial" w:cs="Arial" w:eastAsia="Arial" w:hAnsi="Arial"/>
+                <w:b/>
+                <w:bCs/>
                 <w:sz w:val="18"/>
                 <w:szCs w:val="18"/>
               </w:rPr>
@@ -15108,6 +15220,8 @@
             <w:r>
               <w:rPr>
                 <w:rFonts w:ascii="Arial" w:cs="Arial" w:eastAsia="Arial" w:hAnsi="Arial"/>
+                <w:b/>
+                <w:bCs/>
                 <w:sz w:val="18"/>
                 <w:szCs w:val="18"/>
               </w:rPr>
@@ -15139,6 +15253,8 @@
             <w:r>
               <w:rPr>
                 <w:rFonts w:ascii="Arial" w:cs="Arial" w:eastAsia="Arial" w:hAnsi="Arial"/>
+                <w:b/>
+                <w:bCs/>
                 <w:sz w:val="18"/>
                 <w:szCs w:val="18"/>
               </w:rPr>
@@ -16953,6 +17069,8 @@
             <w:r>
               <w:rPr>
                 <w:rFonts w:ascii="Arial" w:cs="Arial" w:eastAsia="Arial" w:hAnsi="Arial"/>
+                <w:b/>
+                <w:bCs/>
                 <w:sz w:val="18"/>
                 <w:szCs w:val="18"/>
               </w:rPr>
@@ -16974,6 +17092,8 @@
             <w:r>
               <w:rPr>
                 <w:rFonts w:ascii="Arial" w:cs="Arial" w:eastAsia="Arial" w:hAnsi="Arial"/>
+                <w:b/>
+                <w:bCs/>
                 <w:sz w:val="18"/>
                 <w:szCs w:val="18"/>
               </w:rPr>
@@ -16995,6 +17115,8 @@
             <w:r>
               <w:rPr>
                 <w:rFonts w:ascii="Arial" w:cs="Arial" w:eastAsia="Arial" w:hAnsi="Arial"/>
+                <w:b/>
+                <w:bCs/>
                 <w:sz w:val="18"/>
                 <w:szCs w:val="18"/>
               </w:rPr>
@@ -17016,6 +17138,8 @@
             <w:r>
               <w:rPr>
                 <w:rFonts w:ascii="Arial" w:cs="Arial" w:eastAsia="Arial" w:hAnsi="Arial"/>
+                <w:b/>
+                <w:bCs/>
                 <w:sz w:val="18"/>
                 <w:szCs w:val="18"/>
               </w:rPr>
@@ -17037,6 +17161,8 @@
             <w:r>
               <w:rPr>
                 <w:rFonts w:ascii="Arial" w:cs="Arial" w:eastAsia="Arial" w:hAnsi="Arial"/>
+                <w:b/>
+                <w:bCs/>
                 <w:sz w:val="18"/>
                 <w:szCs w:val="18"/>
               </w:rPr>
@@ -17182,6 +17308,8 @@
             <w:r>
               <w:rPr>
                 <w:rFonts w:ascii="Arial" w:cs="Arial" w:eastAsia="Arial" w:hAnsi="Arial"/>
+                <w:b/>
+                <w:bCs/>
                 <w:sz w:val="18"/>
                 <w:szCs w:val="18"/>
               </w:rPr>
@@ -17203,6 +17331,8 @@
             <w:r>
               <w:rPr>
                 <w:rFonts w:ascii="Arial" w:cs="Arial" w:eastAsia="Arial" w:hAnsi="Arial"/>
+                <w:b/>
+                <w:bCs/>
                 <w:sz w:val="18"/>
                 <w:szCs w:val="18"/>
               </w:rPr>
@@ -17224,6 +17354,8 @@
             <w:r>
               <w:rPr>
                 <w:rFonts w:ascii="Arial" w:cs="Arial" w:eastAsia="Arial" w:hAnsi="Arial"/>
+                <w:b/>
+                <w:bCs/>
                 <w:sz w:val="18"/>
                 <w:szCs w:val="18"/>
               </w:rPr>
@@ -17245,6 +17377,8 @@
             <w:r>
               <w:rPr>
                 <w:rFonts w:ascii="Arial" w:cs="Arial" w:eastAsia="Arial" w:hAnsi="Arial"/>
+                <w:b/>
+                <w:bCs/>
                 <w:sz w:val="18"/>
                 <w:szCs w:val="18"/>
               </w:rPr>
@@ -17266,6 +17400,8 @@
             <w:r>
               <w:rPr>
                 <w:rFonts w:ascii="Arial" w:cs="Arial" w:eastAsia="Arial" w:hAnsi="Arial"/>
+                <w:b/>
+                <w:bCs/>
                 <w:sz w:val="18"/>
                 <w:szCs w:val="18"/>
               </w:rPr>
@@ -17411,6 +17547,8 @@
             <w:r>
               <w:rPr>
                 <w:rFonts w:ascii="Arial" w:cs="Arial" w:eastAsia="Arial" w:hAnsi="Arial"/>
+                <w:b/>
+                <w:bCs/>
                 <w:sz w:val="18"/>
                 <w:szCs w:val="18"/>
               </w:rPr>
@@ -17432,6 +17570,8 @@
             <w:r>
               <w:rPr>
                 <w:rFonts w:ascii="Arial" w:cs="Arial" w:eastAsia="Arial" w:hAnsi="Arial"/>
+                <w:b/>
+                <w:bCs/>
                 <w:sz w:val="18"/>
                 <w:szCs w:val="18"/>
               </w:rPr>
@@ -17453,6 +17593,8 @@
             <w:r>
               <w:rPr>
                 <w:rFonts w:ascii="Arial" w:cs="Arial" w:eastAsia="Arial" w:hAnsi="Arial"/>
+                <w:b/>
+                <w:bCs/>
                 <w:sz w:val="18"/>
                 <w:szCs w:val="18"/>
               </w:rPr>
@@ -17474,6 +17616,8 @@
             <w:r>
               <w:rPr>
                 <w:rFonts w:ascii="Arial" w:cs="Arial" w:eastAsia="Arial" w:hAnsi="Arial"/>
+                <w:b/>
+                <w:bCs/>
                 <w:sz w:val="18"/>
                 <w:szCs w:val="18"/>
               </w:rPr>
@@ -17495,6 +17639,8 @@
             <w:r>
               <w:rPr>
                 <w:rFonts w:ascii="Arial" w:cs="Arial" w:eastAsia="Arial" w:hAnsi="Arial"/>
+                <w:b/>
+                <w:bCs/>
                 <w:sz w:val="18"/>
                 <w:szCs w:val="18"/>
               </w:rPr>
@@ -17640,6 +17786,8 @@
             <w:r>
               <w:rPr>
                 <w:rFonts w:ascii="Arial" w:cs="Arial" w:eastAsia="Arial" w:hAnsi="Arial"/>
+                <w:b/>
+                <w:bCs/>
                 <w:sz w:val="18"/>
                 <w:szCs w:val="18"/>
               </w:rPr>
@@ -17661,6 +17809,8 @@
             <w:r>
               <w:rPr>
                 <w:rFonts w:ascii="Arial" w:cs="Arial" w:eastAsia="Arial" w:hAnsi="Arial"/>
+                <w:b/>
+                <w:bCs/>
                 <w:sz w:val="18"/>
                 <w:szCs w:val="18"/>
               </w:rPr>
@@ -17682,6 +17832,8 @@
             <w:r>
               <w:rPr>
                 <w:rFonts w:ascii="Arial" w:cs="Arial" w:eastAsia="Arial" w:hAnsi="Arial"/>
+                <w:b/>
+                <w:bCs/>
                 <w:sz w:val="18"/>
                 <w:szCs w:val="18"/>
               </w:rPr>
@@ -17703,6 +17855,8 @@
             <w:r>
               <w:rPr>
                 <w:rFonts w:ascii="Arial" w:cs="Arial" w:eastAsia="Arial" w:hAnsi="Arial"/>
+                <w:b/>
+                <w:bCs/>
                 <w:sz w:val="18"/>
                 <w:szCs w:val="18"/>
               </w:rPr>
@@ -17724,6 +17878,8 @@
             <w:r>
               <w:rPr>
                 <w:rFonts w:ascii="Arial" w:cs="Arial" w:eastAsia="Arial" w:hAnsi="Arial"/>
+                <w:b/>
+                <w:bCs/>
                 <w:sz w:val="18"/>
                 <w:szCs w:val="18"/>
               </w:rPr>
@@ -17869,6 +18025,8 @@
             <w:r>
               <w:rPr>
                 <w:rFonts w:ascii="Arial" w:cs="Arial" w:eastAsia="Arial" w:hAnsi="Arial"/>
+                <w:b/>
+                <w:bCs/>
                 <w:sz w:val="18"/>
                 <w:szCs w:val="18"/>
               </w:rPr>
@@ -17890,6 +18048,8 @@
             <w:r>
               <w:rPr>
                 <w:rFonts w:ascii="Arial" w:cs="Arial" w:eastAsia="Arial" w:hAnsi="Arial"/>
+                <w:b/>
+                <w:bCs/>
                 <w:sz w:val="18"/>
                 <w:szCs w:val="18"/>
               </w:rPr>
@@ -17911,6 +18071,8 @@
             <w:r>
               <w:rPr>
                 <w:rFonts w:ascii="Arial" w:cs="Arial" w:eastAsia="Arial" w:hAnsi="Arial"/>
+                <w:b/>
+                <w:bCs/>
                 <w:sz w:val="18"/>
                 <w:szCs w:val="18"/>
               </w:rPr>
@@ -17932,6 +18094,8 @@
             <w:r>
               <w:rPr>
                 <w:rFonts w:ascii="Arial" w:cs="Arial" w:eastAsia="Arial" w:hAnsi="Arial"/>
+                <w:b/>
+                <w:bCs/>
                 <w:sz w:val="18"/>
                 <w:szCs w:val="18"/>
               </w:rPr>
@@ -17953,6 +18117,8 @@
             <w:r>
               <w:rPr>
                 <w:rFonts w:ascii="Arial" w:cs="Arial" w:eastAsia="Arial" w:hAnsi="Arial"/>
+                <w:b/>
+                <w:bCs/>
                 <w:sz w:val="18"/>
                 <w:szCs w:val="18"/>
               </w:rPr>
@@ -22720,6 +22886,8 @@
             <w:r>
               <w:rPr>
                 <w:rFonts w:ascii="Arial" w:cs="Arial" w:eastAsia="Arial" w:hAnsi="Arial"/>
+                <w:b/>
+                <w:bCs/>
                 <w:sz w:val="18"/>
                 <w:szCs w:val="18"/>
               </w:rPr>
@@ -22818,6 +22986,8 @@
             <w:r>
               <w:rPr>
                 <w:rFonts w:ascii="Arial" w:cs="Arial" w:eastAsia="Arial" w:hAnsi="Arial"/>
+                <w:b/>
+                <w:bCs/>
                 <w:sz w:val="18"/>
                 <w:szCs w:val="18"/>
               </w:rPr>
@@ -22916,6 +23086,8 @@
             <w:r>
               <w:rPr>
                 <w:rFonts w:ascii="Arial" w:cs="Arial" w:eastAsia="Arial" w:hAnsi="Arial"/>
+                <w:b/>
+                <w:bCs/>
                 <w:sz w:val="18"/>
                 <w:szCs w:val="18"/>
               </w:rPr>
@@ -23014,6 +23186,8 @@
             <w:r>
               <w:rPr>
                 <w:rFonts w:ascii="Arial" w:cs="Arial" w:eastAsia="Arial" w:hAnsi="Arial"/>
+                <w:b/>
+                <w:bCs/>
                 <w:sz w:val="18"/>
                 <w:szCs w:val="18"/>
               </w:rPr>
@@ -23112,6 +23286,8 @@
             <w:r>
               <w:rPr>
                 <w:rFonts w:ascii="Arial" w:cs="Arial" w:eastAsia="Arial" w:hAnsi="Arial"/>
+                <w:b/>
+                <w:bCs/>
                 <w:sz w:val="18"/>
                 <w:szCs w:val="18"/>
               </w:rPr>
@@ -23151,6 +23327,8 @@
             <w:r>
               <w:rPr>
                 <w:rFonts w:ascii="Arial" w:cs="Arial" w:eastAsia="Arial" w:hAnsi="Arial"/>
+                <w:b/>
+                <w:bCs/>
                 <w:sz w:val="18"/>
                 <w:szCs w:val="18"/>
               </w:rPr>

</xml_diff>